<commit_message>
update tracking screenshot and report with actual trajectory visualization
- Replace old screenshots with PICK montage (8-frame grid, real CSV trajectory)
- Update openfield_report.docx: single full-width tracking screenshot
- Update README: single wide tracking image with trajectory caption

Co-Authored-By: Claude Sonnet 4.6 <noreply@anthropic.com>
</commit_message>
<xml_diff>
--- a/openfield_report.docx
+++ b/openfield_report.docx
@@ -880,7 +880,7 @@
           <w:sz w:val="18"/>
           <w:szCs w:val="18"/>
         </w:rPr>
-        <w:t xml:space="preserve">좌: ROI 설정 중 — 다각형 꼭짓점 지정  |  우: 트래킹 중 — Zone 체류 시간 실시간 표시</w:t>
+        <w:t xml:space="preserve">실험 진행 중 트래킹 화면 — 실제 CSV 데이터 기반 이동 궤적 시각화 (마우스 m1, 8개 시점 샘플)</w:t>
       </w:r>
     </w:p>
     <w:tbl>
@@ -896,13 +896,12 @@
         </w:tblBorders>
       </w:tblPr>
       <w:tblGrid>
-        <w:gridCol w:w="4933"/>
-        <w:gridCol w:w="4933"/>
+        <w:gridCol w:w="9866"/>
       </w:tblGrid>
       <w:tr>
         <w:tc>
           <w:tcPr>
-            <w:tcW w:type="dxa" w:w="4933"/>
+            <w:tcW w:type="dxa" w:w="9866"/>
             <w:tcBorders>
               <w:top w:val="none" w:color="FFFFFF" w:sz="0"/>
               <w:left w:val="none" w:color="FFFFFF" w:sz="0"/>
@@ -910,10 +909,10 @@
               <w:right w:val="none" w:color="FFFFFF" w:sz="0"/>
             </w:tcBorders>
             <w:tcMar>
-              <w:top w:type="dxa" w:w="100"/>
-              <w:left w:type="dxa" w:w="140"/>
-              <w:bottom w:type="dxa" w:w="100"/>
-              <w:right w:type="dxa" w:w="140"/>
+              <w:top w:type="dxa" w:w="60"/>
+              <w:left w:type="dxa" w:w="60"/>
+              <w:bottom w:type="dxa" w:w="60"/>
+              <w:right w:type="dxa" w:w="60"/>
             </w:tcMar>
           </w:tcPr>
           <w:p>
@@ -923,9 +922,9 @@
             <w:r>
               <w:drawing>
                 <wp:inline distT="0" distB="0" distL="0" distR="0">
-                  <wp:extent cx="2952750" cy="1666875"/>
+                  <wp:extent cx="5524500" cy="1733550"/>
                   <wp:effectExtent t="0" r="0" b="0" l="0"/>
-                  <wp:docPr id="1" name="oft_a_roi_setup.png" descr="" title="oft_a_roi_setup.png"/>
+                  <wp:docPr id="1" name="oft_b_tracking.png" descr="" title="oft_b_tracking.png"/>
                   <wp:cNvGraphicFramePr>
                     <a:graphicFrameLocks xmlns:a="http://schemas.openxmlformats.org/drawingml/2006/main" noChangeAspect="1"/>
                   </wp:cNvGraphicFramePr>
@@ -948,7 +947,7 @@
                         <pic:spPr bwMode="auto">
                           <a:xfrm>
                             <a:off x="0" y="0"/>
-                            <a:ext cx="2952750" cy="1666875"/>
+                            <a:ext cx="5524500" cy="1733550"/>
                           </a:xfrm>
                           <a:prstGeom prst="rect">
                             <a:avLst/>
@@ -975,86 +974,7 @@
                 <w:sz w:val="17"/>
                 <w:szCs w:val="17"/>
               </w:rPr>
-              <w:t xml:space="preserve">ROI 설정 중 (점 추가 / Enter 확정)</w:t>
-            </w:r>
-          </w:p>
-        </w:tc>
-        <w:tc>
-          <w:tcPr>
-            <w:tcW w:type="dxa" w:w="4933"/>
-            <w:tcBorders>
-              <w:top w:val="none" w:color="FFFFFF" w:sz="0"/>
-              <w:left w:val="none" w:color="FFFFFF" w:sz="0"/>
-              <w:bottom w:val="none" w:color="FFFFFF" w:sz="0"/>
-              <w:right w:val="none" w:color="FFFFFF" w:sz="0"/>
-            </w:tcBorders>
-            <w:tcMar>
-              <w:top w:type="dxa" w:w="100"/>
-              <w:left w:type="dxa" w:w="140"/>
-              <w:bottom w:type="dxa" w:w="100"/>
-              <w:right w:type="dxa" w:w="140"/>
-            </w:tcMar>
-          </w:tcPr>
-          <w:p>
-            <w:pPr>
-              <w:jc w:val="center"/>
-            </w:pPr>
-            <w:r>
-              <w:drawing>
-                <wp:inline distT="0" distB="0" distL="0" distR="0">
-                  <wp:extent cx="2952750" cy="1666875"/>
-                  <wp:effectExtent t="0" r="0" b="0" l="0"/>
-                  <wp:docPr id="1" name="oft_b_tracking.png" descr="" title="oft_b_tracking.png"/>
-                  <wp:cNvGraphicFramePr>
-                    <a:graphicFrameLocks xmlns:a="http://schemas.openxmlformats.org/drawingml/2006/main" noChangeAspect="1"/>
-                  </wp:cNvGraphicFramePr>
-                  <a:graphic xmlns:a="http://schemas.openxmlformats.org/drawingml/2006/main">
-                    <a:graphicData uri="http://schemas.openxmlformats.org/drawingml/2006/picture">
-                      <pic:pic xmlns:pic="http://schemas.openxmlformats.org/drawingml/2006/picture">
-                        <pic:nvPicPr>
-                          <pic:cNvPr id="0" name="" descr=""/>
-                          <pic:cNvPicPr>
-                            <a:picLocks noChangeAspect="1" noChangeArrowheads="1"/>
-                          </pic:cNvPicPr>
-                        </pic:nvPicPr>
-                        <pic:blipFill>
-                          <a:blip r:embed="rId7" cstate="none"/>
-                          <a:srcRect/>
-                          <a:stretch>
-                            <a:fillRect/>
-                          </a:stretch>
-                        </pic:blipFill>
-                        <pic:spPr bwMode="auto">
-                          <a:xfrm>
-                            <a:off x="0" y="0"/>
-                            <a:ext cx="2952750" cy="1666875"/>
-                          </a:xfrm>
-                          <a:prstGeom prst="rect">
-                            <a:avLst/>
-                          </a:prstGeom>
-                        </pic:spPr>
-                      </pic:pic>
-                    </a:graphicData>
-                  </a:graphic>
-                </wp:inline>
-              </w:drawing>
-            </w:r>
-          </w:p>
-          <w:p>
-            <w:pPr>
-              <w:spacing w:before="60"/>
-              <w:jc w:val="center"/>
-            </w:pPr>
-            <w:r>
-              <w:rPr>
-                <w:rFonts w:ascii="Arial" w:cs="Arial" w:eastAsia="Arial" w:hAnsi="Arial"/>
-                <w:i/>
-                <w:iCs/>
-                <w:color w:val="555555"/>
-                <w:sz w:val="17"/>
-                <w:szCs w:val="17"/>
-              </w:rPr>
-              <w:t xml:space="preserve">트래킹 중 (Zone Stats 실시간)</w:t>
+              <w:t xml:space="preserve">트래킹 진행 중 — Zone 체류 통계 실시간 표시, 파란 선: 실제 이동 궤적</w:t>
             </w:r>
           </w:p>
         </w:tc>
@@ -1157,6 +1077,85 @@
                           </pic:cNvPicPr>
                         </pic:nvPicPr>
                         <pic:blipFill>
+                          <a:blip r:embed="rId7" cstate="none"/>
+                          <a:srcRect/>
+                          <a:stretch>
+                            <a:fillRect/>
+                          </a:stretch>
+                        </pic:blipFill>
+                        <pic:spPr bwMode="auto">
+                          <a:xfrm>
+                            <a:off x="0" y="0"/>
+                            <a:ext cx="2286000" cy="1619250"/>
+                          </a:xfrm>
+                          <a:prstGeom prst="rect">
+                            <a:avLst/>
+                          </a:prstGeom>
+                        </pic:spPr>
+                      </pic:pic>
+                    </a:graphicData>
+                  </a:graphic>
+                </wp:inline>
+              </w:drawing>
+            </w:r>
+          </w:p>
+          <w:p>
+            <w:pPr>
+              <w:spacing w:before="50"/>
+              <w:jc w:val="center"/>
+            </w:pPr>
+            <w:r>
+              <w:rPr>
+                <w:rFonts w:ascii="Arial" w:cs="Arial" w:eastAsia="Arial" w:hAnsi="Arial"/>
+                <w:i/>
+                <w:iCs/>
+                <w:color w:val="555555"/>
+                <w:sz w:val="16"/>
+                <w:szCs w:val="16"/>
+              </w:rPr>
+              <w:t xml:space="preserve">이동 경로 (Track Plot)</w:t>
+            </w:r>
+          </w:p>
+        </w:tc>
+        <w:tc>
+          <w:tcPr>
+            <w:tcW w:type="dxa" w:w="4933"/>
+            <w:tcBorders>
+              <w:top w:val="none" w:color="FFFFFF" w:sz="0"/>
+              <w:left w:val="none" w:color="FFFFFF" w:sz="0"/>
+              <w:bottom w:val="none" w:color="FFFFFF" w:sz="0"/>
+              <w:right w:val="none" w:color="FFFFFF" w:sz="0"/>
+            </w:tcBorders>
+            <w:tcMar>
+              <w:top w:type="dxa" w:w="80"/>
+              <w:left w:type="dxa" w:w="80"/>
+              <w:bottom w:type="dxa" w:w="80"/>
+              <w:right w:type="dxa" w:w="80"/>
+            </w:tcMar>
+          </w:tcPr>
+          <w:p>
+            <w:pPr>
+              <w:jc w:val="center"/>
+            </w:pPr>
+            <w:r>
+              <w:drawing>
+                <wp:inline distT="0" distB="0" distL="0" distR="0">
+                  <wp:extent cx="2286000" cy="1619250"/>
+                  <wp:effectExtent t="0" r="0" b="0" l="0"/>
+                  <wp:docPr id="1" name="m1_oft_track_heatmap.png" descr="" title="m1_oft_track_heatmap.png"/>
+                  <wp:cNvGraphicFramePr>
+                    <a:graphicFrameLocks xmlns:a="http://schemas.openxmlformats.org/drawingml/2006/main" noChangeAspect="1"/>
+                  </wp:cNvGraphicFramePr>
+                  <a:graphic xmlns:a="http://schemas.openxmlformats.org/drawingml/2006/main">
+                    <a:graphicData uri="http://schemas.openxmlformats.org/drawingml/2006/picture">
+                      <pic:pic xmlns:pic="http://schemas.openxmlformats.org/drawingml/2006/picture">
+                        <pic:nvPicPr>
+                          <pic:cNvPr id="0" name="" descr=""/>
+                          <pic:cNvPicPr>
+                            <a:picLocks noChangeAspect="1" noChangeArrowheads="1"/>
+                          </pic:cNvPicPr>
+                        </pic:nvPicPr>
+                        <pic:blipFill>
                           <a:blip r:embed="rId8" cstate="none"/>
                           <a:srcRect/>
                           <a:stretch>
@@ -1193,10 +1192,12 @@
                 <w:sz w:val="16"/>
                 <w:szCs w:val="16"/>
               </w:rPr>
-              <w:t xml:space="preserve">이동 경로 (Track Plot)</w:t>
+              <w:t xml:space="preserve">Heatmap (체류 밀도)</w:t>
             </w:r>
           </w:p>
         </w:tc>
+      </w:tr>
+      <w:tr>
         <w:tc>
           <w:tcPr>
             <w:tcW w:type="dxa" w:w="4933"/>
@@ -1222,7 +1223,7 @@
                 <wp:inline distT="0" distB="0" distL="0" distR="0">
                   <wp:extent cx="2286000" cy="1619250"/>
                   <wp:effectExtent t="0" r="0" b="0" l="0"/>
-                  <wp:docPr id="1" name="m1_oft_track_heatmap.png" descr="" title="m1_oft_track_heatmap.png"/>
+                  <wp:docPr id="1" name="m1_oft_track_zone_stats.png" descr="" title="m1_oft_track_zone_stats.png"/>
                   <wp:cNvGraphicFramePr>
                     <a:graphicFrameLocks xmlns:a="http://schemas.openxmlformats.org/drawingml/2006/main" noChangeAspect="1"/>
                   </wp:cNvGraphicFramePr>
@@ -1272,87 +1273,6 @@
                 <w:sz w:val="16"/>
                 <w:szCs w:val="16"/>
               </w:rPr>
-              <w:t xml:space="preserve">Heatmap (체류 밀도)</w:t>
-            </w:r>
-          </w:p>
-        </w:tc>
-      </w:tr>
-      <w:tr>
-        <w:tc>
-          <w:tcPr>
-            <w:tcW w:type="dxa" w:w="4933"/>
-            <w:tcBorders>
-              <w:top w:val="none" w:color="FFFFFF" w:sz="0"/>
-              <w:left w:val="none" w:color="FFFFFF" w:sz="0"/>
-              <w:bottom w:val="none" w:color="FFFFFF" w:sz="0"/>
-              <w:right w:val="none" w:color="FFFFFF" w:sz="0"/>
-            </w:tcBorders>
-            <w:tcMar>
-              <w:top w:type="dxa" w:w="80"/>
-              <w:left w:type="dxa" w:w="80"/>
-              <w:bottom w:type="dxa" w:w="80"/>
-              <w:right w:type="dxa" w:w="80"/>
-            </w:tcMar>
-          </w:tcPr>
-          <w:p>
-            <w:pPr>
-              <w:jc w:val="center"/>
-            </w:pPr>
-            <w:r>
-              <w:drawing>
-                <wp:inline distT="0" distB="0" distL="0" distR="0">
-                  <wp:extent cx="2286000" cy="1619250"/>
-                  <wp:effectExtent t="0" r="0" b="0" l="0"/>
-                  <wp:docPr id="1" name="m1_oft_track_zone_stats.png" descr="" title="m1_oft_track_zone_stats.png"/>
-                  <wp:cNvGraphicFramePr>
-                    <a:graphicFrameLocks xmlns:a="http://schemas.openxmlformats.org/drawingml/2006/main" noChangeAspect="1"/>
-                  </wp:cNvGraphicFramePr>
-                  <a:graphic xmlns:a="http://schemas.openxmlformats.org/drawingml/2006/main">
-                    <a:graphicData uri="http://schemas.openxmlformats.org/drawingml/2006/picture">
-                      <pic:pic xmlns:pic="http://schemas.openxmlformats.org/drawingml/2006/picture">
-                        <pic:nvPicPr>
-                          <pic:cNvPr id="0" name="" descr=""/>
-                          <pic:cNvPicPr>
-                            <a:picLocks noChangeAspect="1" noChangeArrowheads="1"/>
-                          </pic:cNvPicPr>
-                        </pic:nvPicPr>
-                        <pic:blipFill>
-                          <a:blip r:embed="rId10" cstate="none"/>
-                          <a:srcRect/>
-                          <a:stretch>
-                            <a:fillRect/>
-                          </a:stretch>
-                        </pic:blipFill>
-                        <pic:spPr bwMode="auto">
-                          <a:xfrm>
-                            <a:off x="0" y="0"/>
-                            <a:ext cx="2286000" cy="1619250"/>
-                          </a:xfrm>
-                          <a:prstGeom prst="rect">
-                            <a:avLst/>
-                          </a:prstGeom>
-                        </pic:spPr>
-                      </pic:pic>
-                    </a:graphicData>
-                  </a:graphic>
-                </wp:inline>
-              </w:drawing>
-            </w:r>
-          </w:p>
-          <w:p>
-            <w:pPr>
-              <w:spacing w:before="50"/>
-              <w:jc w:val="center"/>
-            </w:pPr>
-            <w:r>
-              <w:rPr>
-                <w:rFonts w:ascii="Arial" w:cs="Arial" w:eastAsia="Arial" w:hAnsi="Arial"/>
-                <w:i/>
-                <w:iCs/>
-                <w:color w:val="555555"/>
-                <w:sz w:val="16"/>
-                <w:szCs w:val="16"/>
-              </w:rPr>
               <w:t xml:space="preserve">Zone 체류 통계</w:t>
             </w:r>
           </w:p>
@@ -1396,7 +1316,7 @@
                           </pic:cNvPicPr>
                         </pic:nvPicPr>
                         <pic:blipFill>
-                          <a:blip r:embed="rId11" cstate="none"/>
+                          <a:blip r:embed="rId10" cstate="none"/>
                           <a:srcRect/>
                           <a:stretch>
                             <a:fillRect/>
@@ -1516,6 +1436,85 @@
                           </pic:cNvPicPr>
                         </pic:nvPicPr>
                         <pic:blipFill>
+                          <a:blip r:embed="rId11" cstate="none"/>
+                          <a:srcRect/>
+                          <a:stretch>
+                            <a:fillRect/>
+                          </a:stretch>
+                        </pic:blipFill>
+                        <pic:spPr bwMode="auto">
+                          <a:xfrm>
+                            <a:off x="0" y="0"/>
+                            <a:ext cx="2286000" cy="1619250"/>
+                          </a:xfrm>
+                          <a:prstGeom prst="rect">
+                            <a:avLst/>
+                          </a:prstGeom>
+                        </pic:spPr>
+                      </pic:pic>
+                    </a:graphicData>
+                  </a:graphic>
+                </wp:inline>
+              </w:drawing>
+            </w:r>
+          </w:p>
+          <w:p>
+            <w:pPr>
+              <w:spacing w:before="50"/>
+              <w:jc w:val="center"/>
+            </w:pPr>
+            <w:r>
+              <w:rPr>
+                <w:rFonts w:ascii="Arial" w:cs="Arial" w:eastAsia="Arial" w:hAnsi="Arial"/>
+                <w:i/>
+                <w:iCs/>
+                <w:color w:val="555555"/>
+                <w:sz w:val="16"/>
+                <w:szCs w:val="16"/>
+              </w:rPr>
+              <w:t xml:space="preserve">Center 체류 시간 (성별)</w:t>
+            </w:r>
+          </w:p>
+        </w:tc>
+        <w:tc>
+          <w:tcPr>
+            <w:tcW w:type="dxa" w:w="4933"/>
+            <w:tcBorders>
+              <w:top w:val="none" w:color="FFFFFF" w:sz="0"/>
+              <w:left w:val="none" w:color="FFFFFF" w:sz="0"/>
+              <w:bottom w:val="none" w:color="FFFFFF" w:sz="0"/>
+              <w:right w:val="none" w:color="FFFFFF" w:sz="0"/>
+            </w:tcBorders>
+            <w:tcMar>
+              <w:top w:type="dxa" w:w="80"/>
+              <w:left w:type="dxa" w:w="80"/>
+              <w:bottom w:type="dxa" w:w="80"/>
+              <w:right w:type="dxa" w:w="80"/>
+            </w:tcMar>
+          </w:tcPr>
+          <w:p>
+            <w:pPr>
+              <w:jc w:val="center"/>
+            </w:pPr>
+            <w:r>
+              <w:drawing>
+                <wp:inline distT="0" distB="0" distL="0" distR="0">
+                  <wp:extent cx="2286000" cy="1619250"/>
+                  <wp:effectExtent t="0" r="0" b="0" l="0"/>
+                  <wp:docPr id="1" name="oft_sex_comparison_visits.png" descr="" title="oft_sex_comparison_visits.png"/>
+                  <wp:cNvGraphicFramePr>
+                    <a:graphicFrameLocks xmlns:a="http://schemas.openxmlformats.org/drawingml/2006/main" noChangeAspect="1"/>
+                  </wp:cNvGraphicFramePr>
+                  <a:graphic xmlns:a="http://schemas.openxmlformats.org/drawingml/2006/main">
+                    <a:graphicData uri="http://schemas.openxmlformats.org/drawingml/2006/picture">
+                      <pic:pic xmlns:pic="http://schemas.openxmlformats.org/drawingml/2006/picture">
+                        <pic:nvPicPr>
+                          <pic:cNvPr id="0" name="" descr=""/>
+                          <pic:cNvPicPr>
+                            <a:picLocks noChangeAspect="1" noChangeArrowheads="1"/>
+                          </pic:cNvPicPr>
+                        </pic:nvPicPr>
+                        <pic:blipFill>
                           <a:blip r:embed="rId12" cstate="none"/>
                           <a:srcRect/>
                           <a:stretch>
@@ -1552,10 +1551,12 @@
                 <w:sz w:val="16"/>
                 <w:szCs w:val="16"/>
               </w:rPr>
-              <w:t xml:space="preserve">Center 체류 시간 (성별)</w:t>
+              <w:t xml:space="preserve">Center 방문 횟수 (성별)</w:t>
             </w:r>
           </w:p>
         </w:tc>
+      </w:tr>
+      <w:tr>
         <w:tc>
           <w:tcPr>
             <w:tcW w:type="dxa" w:w="4933"/>
@@ -1581,7 +1582,7 @@
                 <wp:inline distT="0" distB="0" distL="0" distR="0">
                   <wp:extent cx="2286000" cy="1619250"/>
                   <wp:effectExtent t="0" r="0" b="0" l="0"/>
-                  <wp:docPr id="1" name="oft_sex_comparison_visits.png" descr="" title="oft_sex_comparison_visits.png"/>
+                  <wp:docPr id="1" name="oft_sex_comparison_mean_dwell.png" descr="" title="oft_sex_comparison_mean_dwell.png"/>
                   <wp:cNvGraphicFramePr>
                     <a:graphicFrameLocks xmlns:a="http://schemas.openxmlformats.org/drawingml/2006/main" noChangeAspect="1"/>
                   </wp:cNvGraphicFramePr>
@@ -1631,87 +1632,6 @@
                 <w:sz w:val="16"/>
                 <w:szCs w:val="16"/>
               </w:rPr>
-              <w:t xml:space="preserve">Center 방문 횟수 (성별)</w:t>
-            </w:r>
-          </w:p>
-        </w:tc>
-      </w:tr>
-      <w:tr>
-        <w:tc>
-          <w:tcPr>
-            <w:tcW w:type="dxa" w:w="4933"/>
-            <w:tcBorders>
-              <w:top w:val="none" w:color="FFFFFF" w:sz="0"/>
-              <w:left w:val="none" w:color="FFFFFF" w:sz="0"/>
-              <w:bottom w:val="none" w:color="FFFFFF" w:sz="0"/>
-              <w:right w:val="none" w:color="FFFFFF" w:sz="0"/>
-            </w:tcBorders>
-            <w:tcMar>
-              <w:top w:type="dxa" w:w="80"/>
-              <w:left w:type="dxa" w:w="80"/>
-              <w:bottom w:type="dxa" w:w="80"/>
-              <w:right w:type="dxa" w:w="80"/>
-            </w:tcMar>
-          </w:tcPr>
-          <w:p>
-            <w:pPr>
-              <w:jc w:val="center"/>
-            </w:pPr>
-            <w:r>
-              <w:drawing>
-                <wp:inline distT="0" distB="0" distL="0" distR="0">
-                  <wp:extent cx="2286000" cy="1619250"/>
-                  <wp:effectExtent t="0" r="0" b="0" l="0"/>
-                  <wp:docPr id="1" name="oft_sex_comparison_mean_dwell.png" descr="" title="oft_sex_comparison_mean_dwell.png"/>
-                  <wp:cNvGraphicFramePr>
-                    <a:graphicFrameLocks xmlns:a="http://schemas.openxmlformats.org/drawingml/2006/main" noChangeAspect="1"/>
-                  </wp:cNvGraphicFramePr>
-                  <a:graphic xmlns:a="http://schemas.openxmlformats.org/drawingml/2006/main">
-                    <a:graphicData uri="http://schemas.openxmlformats.org/drawingml/2006/picture">
-                      <pic:pic xmlns:pic="http://schemas.openxmlformats.org/drawingml/2006/picture">
-                        <pic:nvPicPr>
-                          <pic:cNvPr id="0" name="" descr=""/>
-                          <pic:cNvPicPr>
-                            <a:picLocks noChangeAspect="1" noChangeArrowheads="1"/>
-                          </pic:cNvPicPr>
-                        </pic:nvPicPr>
-                        <pic:blipFill>
-                          <a:blip r:embed="rId14" cstate="none"/>
-                          <a:srcRect/>
-                          <a:stretch>
-                            <a:fillRect/>
-                          </a:stretch>
-                        </pic:blipFill>
-                        <pic:spPr bwMode="auto">
-                          <a:xfrm>
-                            <a:off x="0" y="0"/>
-                            <a:ext cx="2286000" cy="1619250"/>
-                          </a:xfrm>
-                          <a:prstGeom prst="rect">
-                            <a:avLst/>
-                          </a:prstGeom>
-                        </pic:spPr>
-                      </pic:pic>
-                    </a:graphicData>
-                  </a:graphic>
-                </wp:inline>
-              </w:drawing>
-            </w:r>
-          </w:p>
-          <w:p>
-            <w:pPr>
-              <w:spacing w:before="50"/>
-              <w:jc w:val="center"/>
-            </w:pPr>
-            <w:r>
-              <w:rPr>
-                <w:rFonts w:ascii="Arial" w:cs="Arial" w:eastAsia="Arial" w:hAnsi="Arial"/>
-                <w:i/>
-                <w:iCs/>
-                <w:color w:val="555555"/>
-                <w:sz w:val="16"/>
-                <w:szCs w:val="16"/>
-              </w:rPr>
               <w:t xml:space="preserve">평균 체류 시간 (성별)</w:t>
             </w:r>
           </w:p>
@@ -1755,7 +1675,7 @@
                           </pic:cNvPicPr>
                         </pic:nvPicPr>
                         <pic:blipFill>
-                          <a:blip r:embed="rId15" cstate="none"/>
+                          <a:blip r:embed="rId14" cstate="none"/>
                           <a:srcRect/>
                           <a:stretch>
                             <a:fillRect/>

</xml_diff>